<commit_message>
docs: Ventoy note (normal mode only) + dual-arch/Ventoy ISO in use instructions
</commit_message>
<xml_diff>
--- a/docs/manual/gsetupmod-产品说明书-简版.docx
+++ b/docs/manual/gsetupmod-产品说明书-简版.docx
@@ -1505,7 +1505,25 @@
         <w:t>无 Shell 直启。</w:t>
       </w:r>
       <w:r>
-        <w:t xml:space="preserve"> 固件 Boot Manager 直接加载 `EFI\BOOT\BOOTX64.EFI`——U 盘启动盘一键做好，没有 Shell 的机器一样能用；唯一要求是关闭 Secure Boot。</w:t>
+        <w:t xml:space="preserve"> 固件 Boot Manager 直接加载 `EFI\BOOT\BOOTX64.EFI`（ARM64 平台用 `BOOTAA64.EFI`）——U 盘启动盘一键做好，没有 Shell 的机器一样能用；唯一要求是关闭 Secure Boot。</w:t>
+      </w:r>
+      <w:r>
+        <w:rPr>
+          <w:b/>
+        </w:rPr>
+        <w:t>Ventoy 兼容</w:t>
+      </w:r>
+      <w:r>
+        <w:t>：拷进 Ventoy U 盘请选「正常模式」，</w:t>
+      </w:r>
+      <w:r>
+        <w:rPr>
+          <w:b/>
+        </w:rPr>
+        <w:t>GRUB2 模式不受支持</w:t>
+      </w:r>
+      <w:r>
+        <w:t>。</w:t>
       </w:r>
     </w:p>
     <w:p>

</xml_diff>